<commit_message>
Versión preliminar de Donapp con correcciones críticas
</commit_message>
<xml_diff>
--- a/donapp/public/assets/docs/AutorizacionRegistroDonapp.docx
+++ b/donapp/public/assets/docs/AutorizacionRegistroDonapp.docx
@@ -39,7 +39,7 @@
               <w:bottom w:val="none" w:sz="0" w:space="0" w:color="FFFFFF"/>
               <w:right w:val="none" w:sz="0" w:space="0" w:color="FFFFFF"/>
             </w:tcBorders>
-            <w:shd w:val="clear" w:color="auto" w:fill="C0392B"/>
+            <w:shd w:val="clear" w:color="auto" w:fill="0B5AA6"/>
             <w:tcMar>
               <w:top w:w="0" w:type="dxa"/>
               <w:left w:w="0" w:type="dxa"/>
@@ -58,7 +58,7 @@
               <w:bottom w:val="none" w:sz="0" w:space="0" w:color="FFFFFF"/>
               <w:right w:val="none" w:sz="0" w:space="0" w:color="FFFFFF"/>
             </w:tcBorders>
-            <w:shd w:val="clear" w:color="auto" w:fill="F9EBEA"/>
+            <w:shd w:val="clear" w:color="auto" w:fill="E7EFF6"/>
             <w:tcMar>
               <w:top w:w="160" w:type="dxa"/>
               <w:left w:w="300" w:type="dxa"/>
@@ -76,7 +76,7 @@
               <w:rPr>
                 <w:b/>
                 <w:bCs/>
-                <w:color w:val="C0392B"/>
+                <w:color w:val="0B5AA6"/>
                 <w:sz w:val="19"/>
                 <w:szCs w:val="19"/>
                 <w:lang w:val="es-CO"/>
@@ -133,7 +133,7 @@
     <w:p>
       <w:pPr>
         <w:pBdr>
-          <w:bottom w:val="single" w:sz="8" w:space="4" w:color="C0392B"/>
+          <w:bottom w:val="single" w:sz="8" w:space="4" w:color="0B5AA6"/>
         </w:pBdr>
         <w:spacing w:before="120" w:after="180"/>
         <w:rPr>
@@ -144,7 +144,7 @@
         <w:rPr>
           <w:b/>
           <w:bCs/>
-          <w:color w:val="C0392B"/>
+          <w:color w:val="0B5AA6"/>
           <w:sz w:val="22"/>
           <w:szCs w:val="22"/>
           <w:lang w:val="es-CO"/>
@@ -1235,7 +1235,7 @@
     <w:p>
       <w:pPr>
         <w:pBdr>
-          <w:bottom w:val="single" w:sz="8" w:space="4" w:color="C0392B"/>
+          <w:bottom w:val="single" w:sz="8" w:space="4" w:color="0B5AA6"/>
         </w:pBdr>
         <w:spacing w:before="120" w:after="180"/>
         <w:rPr>
@@ -1246,7 +1246,7 @@
         <w:rPr>
           <w:b/>
           <w:bCs/>
-          <w:color w:val="C0392B"/>
+          <w:color w:val="0B5AA6"/>
           <w:sz w:val="22"/>
           <w:szCs w:val="22"/>
           <w:lang w:val="es-CO"/>
@@ -2008,7 +2008,7 @@
     <w:p>
       <w:pPr>
         <w:pBdr>
-          <w:bottom w:val="single" w:sz="8" w:space="4" w:color="C0392B"/>
+          <w:bottom w:val="single" w:sz="8" w:space="4" w:color="0B5AA6"/>
         </w:pBdr>
         <w:spacing w:before="120" w:after="180"/>
       </w:pPr>
@@ -2016,7 +2016,7 @@
         <w:rPr>
           <w:b/>
           <w:bCs/>
-          <w:color w:val="C0392B"/>
+          <w:color w:val="0B5AA6"/>
           <w:sz w:val="22"/>
           <w:szCs w:val="22"/>
         </w:rPr>
@@ -2060,7 +2060,7 @@
               <w:bottom w:val="none" w:sz="0" w:space="0" w:color="FFFFFF"/>
               <w:right w:val="none" w:sz="0" w:space="0" w:color="FFFFFF"/>
             </w:tcBorders>
-            <w:shd w:val="clear" w:color="auto" w:fill="C0392B"/>
+            <w:shd w:val="clear" w:color="auto" w:fill="0B5AA6"/>
             <w:tcMar>
               <w:top w:w="0" w:type="dxa"/>
               <w:left w:w="0" w:type="dxa"/>
@@ -2079,7 +2079,7 @@
               <w:bottom w:val="none" w:sz="0" w:space="0" w:color="FFFFFF"/>
               <w:right w:val="none" w:sz="0" w:space="0" w:color="FFFFFF"/>
             </w:tcBorders>
-            <w:shd w:val="clear" w:color="auto" w:fill="F9EBEA"/>
+            <w:shd w:val="clear" w:color="auto" w:fill="E7EFF6"/>
             <w:tcMar>
               <w:top w:w="160" w:type="dxa"/>
               <w:left w:w="240" w:type="dxa"/>
@@ -2098,7 +2098,7 @@
               <w:rPr>
                 <w:b/>
                 <w:bCs/>
-                <w:color w:val="C0392B"/>
+                <w:color w:val="0B5AA6"/>
                 <w:sz w:val="20"/>
                 <w:szCs w:val="20"/>
                 <w:lang w:val="es-CO"/>
@@ -2515,7 +2515,7 @@
               <w:bottom w:val="single" w:sz="6" w:space="0" w:color="CCCCCC"/>
               <w:right w:val="single" w:sz="6" w:space="0" w:color="CCCCCC"/>
             </w:tcBorders>
-            <w:shd w:val="clear" w:color="auto" w:fill="C0392B"/>
+            <w:shd w:val="clear" w:color="auto" w:fill="0B5AA6"/>
             <w:tcMar>
               <w:top w:w="100" w:type="dxa"/>
               <w:left w:w="150" w:type="dxa"/>
@@ -2549,7 +2549,7 @@
               <w:bottom w:val="single" w:sz="6" w:space="0" w:color="CCCCCC"/>
               <w:right w:val="single" w:sz="6" w:space="0" w:color="CCCCCC"/>
             </w:tcBorders>
-            <w:shd w:val="clear" w:color="auto" w:fill="C0392B"/>
+            <w:shd w:val="clear" w:color="auto" w:fill="0B5AA6"/>
             <w:tcMar>
               <w:top w:w="100" w:type="dxa"/>
               <w:left w:w="150" w:type="dxa"/>

</xml_diff>